<commit_message>
Fix variance-ratio bug: use standardized alpha for violence items
Violence items have 185:1 variance ratio (patient violence much more
common than manager violence). Raw alpha (0.31) was misleading —
standardized alpha (0.88) correctly reflects the strong inter-item
correlations. Also fixes "fit fit" double-word in assessment text.

https://claude.ai/code/session_01MBYssKwPmq3tE1Z6L26PN7
</commit_message>
<xml_diff>
--- a/output/NOF_2024_Hierarchical_Assessment.docx
+++ b/output/NOF_2024_Hierarchical_Assessment.docx
@@ -193,14 +193,26 @@
         <w:rPr>
           <w:b/>
         </w:rPr>
-        <w:t xml:space="preserve">Overall reliability: α = 0.31 — Poor </w:t>
+        <w:t xml:space="preserve">Overall reliability: standardized α = 0.88 — Good </w:t>
       </w:r>
       <w:r>
         <w:rPr>
           <w:b/>
-          <w:color w:val="CC0000"/>
+          <w:color w:val="008000"/>
         </w:rPr>
-        <w:t>[RED]</w:t>
+        <w:t>[GREEN]</w:t>
+      </w:r>
+    </w:p>
+    <w:p>
+      <w:r>
+        <w:rPr>
+          <w:b/>
+          <w:color w:val="FF8C00"/>
+        </w:rPr>
+        <w:t xml:space="preserve">Technical note: </w:t>
+      </w:r>
+      <w:r>
+        <w:t>Item variances differ by 185:1 (e.g. patient violence is far more common than manager violence). Raw α = 0.31 is misleading here — the standardized α = 0.88 (based on correlations, not covariances) is the correct measure. The questions genuinely belong together.</w:t>
       </w:r>
     </w:p>
     <w:tbl>
@@ -369,7 +381,7 @@
               <w:rPr>
                 <w:sz w:val="18"/>
               </w:rPr>
-              <w:t>Strong fit fit; loads strong</w:t>
+              <w:t>Strong fit; loads strong</w:t>
             </w:r>
           </w:p>
         </w:tc>
@@ -451,7 +463,7 @@
               <w:rPr>
                 <w:sz w:val="18"/>
               </w:rPr>
-              <w:t>Strong fit fit; loads strong</w:t>
+              <w:t>Strong fit; loads strong</w:t>
             </w:r>
           </w:p>
         </w:tc>
@@ -533,7 +545,7 @@
               <w:rPr>
                 <w:sz w:val="18"/>
               </w:rPr>
-              <w:t>Strong fit fit; loads strong</w:t>
+              <w:t>Strong fit; loads strong</w:t>
             </w:r>
           </w:p>
         </w:tc>
@@ -755,7 +767,7 @@
               <w:rPr>
                 <w:sz w:val="18"/>
               </w:rPr>
-              <w:t>Adequate fit fit; loads strong</w:t>
+              <w:t>Adequate fit; loads strong</w:t>
             </w:r>
           </w:p>
         </w:tc>
@@ -837,7 +849,7 @@
               <w:rPr>
                 <w:sz w:val="18"/>
               </w:rPr>
-              <w:t>Adequate fit fit; loads strong</w:t>
+              <w:t>Adequate fit; loads strong</w:t>
             </w:r>
           </w:p>
         </w:tc>
@@ -919,7 +931,7 @@
               <w:rPr>
                 <w:sz w:val="18"/>
               </w:rPr>
-              <w:t>Very strong fit fit; loads strong</w:t>
+              <w:t>Very strong fit; loads strong</w:t>
             </w:r>
           </w:p>
         </w:tc>
@@ -1347,7 +1359,7 @@
               <w:rPr>
                 <w:sz w:val="18"/>
               </w:rPr>
-              <w:t>Very strong fit fit; loads strong</w:t>
+              <w:t>Very strong fit; loads strong</w:t>
             </w:r>
           </w:p>
         </w:tc>
@@ -1429,7 +1441,7 @@
               <w:rPr>
                 <w:sz w:val="18"/>
               </w:rPr>
-              <w:t>Very strong fit fit; loads moderate</w:t>
+              <w:t>Very strong fit; loads moderate</w:t>
             </w:r>
           </w:p>
         </w:tc>
@@ -1511,7 +1523,7 @@
               <w:rPr>
                 <w:sz w:val="18"/>
               </w:rPr>
-              <w:t>Very strong fit fit; loads strong</w:t>
+              <w:t>Very strong fit; loads strong</w:t>
             </w:r>
           </w:p>
         </w:tc>
@@ -1721,7 +1733,7 @@
               <w:rPr>
                 <w:sz w:val="18"/>
               </w:rPr>
-              <w:t>Strong fit fit; loads strong</w:t>
+              <w:t>Strong fit; loads strong</w:t>
             </w:r>
           </w:p>
         </w:tc>
@@ -1803,7 +1815,7 @@
               <w:rPr>
                 <w:sz w:val="18"/>
               </w:rPr>
-              <w:t>Very strong fit fit; loads strong</w:t>
+              <w:t>Very strong fit; loads strong</w:t>
             </w:r>
           </w:p>
         </w:tc>
@@ -1885,7 +1897,7 @@
               <w:rPr>
                 <w:sz w:val="18"/>
               </w:rPr>
-              <w:t>Very strong fit fit; loads strong</w:t>
+              <w:t>Very strong fit; loads strong</w:t>
             </w:r>
           </w:p>
         </w:tc>
@@ -1967,7 +1979,7 @@
               <w:rPr>
                 <w:sz w:val="18"/>
               </w:rPr>
-              <w:t>Very strong fit fit; loads moderate</w:t>
+              <w:t>Very strong fit; loads moderate</w:t>
             </w:r>
           </w:p>
         </w:tc>
@@ -2049,7 +2061,7 @@
               <w:rPr>
                 <w:sz w:val="18"/>
               </w:rPr>
-              <w:t>Very strong fit fit; loads moderate</w:t>
+              <w:t>Very strong fit; loads moderate</w:t>
             </w:r>
           </w:p>
         </w:tc>
@@ -2131,7 +2143,7 @@
               <w:rPr>
                 <w:sz w:val="18"/>
               </w:rPr>
-              <w:t>Weak fit fit; loads strong</w:t>
+              <w:t>Weak fit; loads strong</w:t>
             </w:r>
           </w:p>
         </w:tc>
@@ -2213,7 +2225,7 @@
               <w:rPr>
                 <w:sz w:val="18"/>
               </w:rPr>
-              <w:t>Strong fit fit; loads strong</w:t>
+              <w:t>Strong fit; loads strong</w:t>
             </w:r>
           </w:p>
         </w:tc>
@@ -2295,7 +2307,7 @@
               <w:rPr>
                 <w:sz w:val="18"/>
               </w:rPr>
-              <w:t>Very strong fit fit; loads strong</w:t>
+              <w:t>Very strong fit; loads strong</w:t>
             </w:r>
           </w:p>
         </w:tc>
@@ -2377,7 +2389,7 @@
               <w:rPr>
                 <w:sz w:val="18"/>
               </w:rPr>
-              <w:t>Very strong fit fit; loads strong</w:t>
+              <w:t>Very strong fit; loads strong</w:t>
             </w:r>
           </w:p>
         </w:tc>
@@ -2459,7 +2471,7 @@
               <w:rPr>
                 <w:sz w:val="18"/>
               </w:rPr>
-              <w:t>Strong fit fit; loads strong</w:t>
+              <w:t>Strong fit; loads strong</w:t>
             </w:r>
           </w:p>
         </w:tc>
@@ -3052,7 +3064,7 @@
               <w:rPr>
                 <w:sz w:val="18"/>
               </w:rPr>
-              <w:t>Adequate fit fit; loads moderate</w:t>
+              <w:t>Adequate fit; loads moderate</w:t>
             </w:r>
           </w:p>
         </w:tc>
@@ -3134,7 +3146,7 @@
               <w:rPr>
                 <w:sz w:val="18"/>
               </w:rPr>
-              <w:t>Adequate fit fit; loads moderate</w:t>
+              <w:t>Adequate fit; loads moderate</w:t>
             </w:r>
           </w:p>
         </w:tc>

</xml_diff>